<commit_message>
test(docx): add Word export QA and regression
</commit_message>
<xml_diff>
--- a/tests/golden/docx/GOLDEN_02_NATIVE_MATH.docx
+++ b/tests/golden/docx/GOLDEN_02_NATIVE_MATH.docx
@@ -1,10 +1,13 @@
 
 <file path=word/document.xml><?xml version="1.0" encoding="utf-8"?>
-<w:document xmlns:w="http://schemas.openxmlformats.org/wordprocessingml/2006/main" xmlns:r="http://schemas.openxmlformats.org/officeDocument/2006/relationships" xmlns:m="http://schemas.openxmlformats.org/officeDocument/2006/math">
+<w:document xmlns:w="http://schemas.openxmlformats.org/wordprocessingml/2006/main" xmlns:r="http://schemas.openxmlformats.org/officeDocument/2006/relationships" xmlns:m="http://schemas.openxmlformats.org/officeDocument/2006/math" xmlns:wp="http://schemas.openxmlformats.org/drawingml/2006/wordprocessingDrawing" xmlns:asvg="http://schemas.microsoft.com/office/drawing/2016/SVG/main">
   <w:body>
     <w:p>
       <w:pPr>
         <w:pStyle w:val="NABody"/>
+        <w:keepLines/>
+        <w:widowControl/>
+        <w:spacing w:after="120"/>
       </w:pPr>
       <m:oMath>
         <m:oMathPr>
@@ -46,6 +49,9 @@
     <w:p>
       <w:pPr>
         <w:pStyle w:val="NABody"/>
+        <w:keepLines/>
+        <w:widowControl/>
+        <w:spacing w:after="120"/>
       </w:pPr>
       <m:oMath>
         <m:oMathPr>
@@ -78,6 +84,9 @@
     <w:p>
       <w:pPr>
         <w:pStyle w:val="NABody"/>
+        <w:keepLines/>
+        <w:widowControl/>
+        <w:spacing w:after="120"/>
       </w:pPr>
       <m:oMath>
         <m:oMathPr>
@@ -107,6 +116,9 @@
     <w:p>
       <w:pPr>
         <w:pStyle w:val="NABody"/>
+        <w:keepLines/>
+        <w:widowControl/>
+        <w:spacing w:after="120"/>
       </w:pPr>
       <m:oMath>
         <m:oMathPr>
@@ -136,44 +148,9 @@
     <w:p>
       <w:pPr>
         <w:pStyle w:val="NABody"/>
-      </w:pPr>
-      <m:oMath>
-        <m:oMathPr>
-          <m:ctrlPr>
-            <w:rPr>
-              <w:rFonts w:ascii="Libertinus Math" w:hAnsi="Libertinus Math"/>
-            </w:rPr>
-          </m:ctrlPr>
-        </m:oMathPr>
-        <m:r>
-          <m:t>a</m:t>
-        </m:r>
-        <m:r>
-          <m:t>∩</m:t>
-        </m:r>
-        <m:r>
-          <m:t> </m:t>
-        </m:r>
-        <m:r>
-          <m:t>b</m:t>
-        </m:r>
-        <m:r>
-          <m:t>=</m:t>
-        </m:r>
-        <m:r>
-          <m:t>{</m:t>
-        </m:r>
-        <m:r>
-          <m:t>M</m:t>
-        </m:r>
-        <m:r>
-          <m:t>}</m:t>
-        </m:r>
-      </m:oMath>
-    </w:p>
-    <w:p>
-      <w:pPr>
-        <w:pStyle w:val="NABody"/>
+        <w:keepLines/>
+        <w:widowControl/>
+        <w:spacing w:after="120"/>
       </w:pPr>
       <m:oMath>
         <m:oMathPr>
@@ -198,6 +175,9 @@
     <w:p>
       <w:pPr>
         <w:pStyle w:val="NABody"/>
+        <w:keepLines/>
+        <w:widowControl/>
+        <w:spacing w:after="120"/>
       </w:pPr>
       <m:oMath>
         <m:oMathPr>
@@ -237,6 +217,9 @@
     <w:p>
       <w:pPr>
         <w:pStyle w:val="NABody"/>
+        <w:keepLines/>
+        <w:widowControl/>
+        <w:spacing w:after="120"/>
       </w:pPr>
       <m:oMath>
         <m:oMathPr>
@@ -264,6 +247,9 @@
     <w:p>
       <w:pPr>
         <w:pStyle w:val="NABody"/>
+        <w:keepLines/>
+        <w:widowControl/>
+        <w:spacing w:after="120"/>
       </w:pPr>
       <m:oMath>
         <m:oMathPr>
@@ -288,6 +274,9 @@
     <w:p>
       <w:pPr>
         <w:pStyle w:val="NABody"/>
+        <w:keepLines/>
+        <w:widowControl/>
+        <w:spacing w:after="120"/>
       </w:pPr>
       <m:oMath>
         <m:oMathPr>
@@ -318,6 +307,9 @@
     <w:p>
       <w:pPr>
         <w:pStyle w:val="NABody"/>
+        <w:keepLines/>
+        <w:widowControl/>
+        <w:spacing w:after="120"/>
       </w:pPr>
       <m:oMath>
         <m:oMathPr>
@@ -347,6 +339,9 @@
     <w:p>
       <w:pPr>
         <w:pStyle w:val="NABody"/>
+        <w:keepLines/>
+        <w:widowControl/>
+        <w:spacing w:after="120"/>
       </w:pPr>
       <m:oMath>
         <m:oMathPr>
@@ -385,6 +380,9 @@
     <w:p>
       <w:pPr>
         <w:pStyle w:val="NABody"/>
+        <w:keepLines/>
+        <w:widowControl/>
+        <w:spacing w:after="120"/>
       </w:pPr>
       <m:oMath>
         <m:oMathPr>
@@ -420,6 +418,9 @@
     <w:p>
       <w:pPr>
         <w:pStyle w:val="NABody"/>
+        <w:keepLines/>
+        <w:widowControl/>
+        <w:spacing w:after="120"/>
       </w:pPr>
       <m:oMath>
         <m:oMathPr>
@@ -455,6 +456,9 @@
     <w:p>
       <w:pPr>
         <w:pStyle w:val="NABody"/>
+        <w:keepLines/>
+        <w:widowControl/>
+        <w:spacing w:after="120"/>
       </w:pPr>
       <m:oMath>
         <m:oMathPr>
@@ -514,6 +518,9 @@
     <w:p>
       <w:pPr>
         <w:pStyle w:val="NABody"/>
+        <w:keepLines/>
+        <w:widowControl/>
+        <w:spacing w:after="120"/>
       </w:pPr>
       <m:oMath>
         <m:oMathPr>
@@ -570,35 +577,9 @@
     <w:p>
       <w:pPr>
         <w:pStyle w:val="NABody"/>
-      </w:pPr>
-      <m:oMath>
-        <m:oMathPr>
-          <m:ctrlPr>
-            <w:rPr>
-              <w:rFonts w:ascii="Libertinus Math" w:hAnsi="Libertinus Math"/>
-            </w:rPr>
-          </m:ctrlPr>
-        </m:oMathPr>
-        <m:r>
-          <m:t>f</m:t>
-        </m:r>
-        <m:r>
-          <m:t>'</m:t>
-        </m:r>
-        <m:r>
-          <m:t>(</m:t>
-        </m:r>
-        <m:r>
-          <m:t>x</m:t>
-        </m:r>
-        <m:r>
-          <m:t>)</m:t>
-        </m:r>
-      </m:oMath>
-    </w:p>
-    <w:p>
-      <w:pPr>
-        <w:pStyle w:val="NABody"/>
+        <w:keepLines/>
+        <w:widowControl/>
+        <w:spacing w:after="120"/>
       </w:pPr>
       <m:oMath>
         <m:oMathPr>
@@ -657,7 +638,7 @@
     </w:p>
     <w:sectPr>
       <w:pgSz w:w="11906" w:h="16838"/>
-      <w:pgMar w:top="1021" w:right="1021" w:bottom="1021" w:left="1021" w:header="708" w:footer="708" w:gutter="0"/>
+      <w:pgMar w:top="1020" w:right="1020" w:bottom="1020" w:left="1020" w:header="708" w:footer="708" w:gutter="0"/>
     </w:sectPr>
   </w:body>
 </w:document>
@@ -676,6 +657,11 @@
     <w:name w:val="NA Title"/>
     <w:basedOn w:val="NABody"/>
     <w:qFormat/>
+    <w:pPr>
+      <w:keepNext/>
+      <w:widowControl/>
+      <w:spacing w:after="120"/>
+    </w:pPr>
     <w:rPr>
       <w:rFonts w:ascii="Source Sans 3" w:hAnsi="Source Sans 3" w:eastAsia="Source Sans 3"/>
       <w:color w:val="0C2D57"/>
@@ -688,6 +674,11 @@
     <w:name w:val="NA Subtitle"/>
     <w:basedOn w:val="NABody"/>
     <w:qFormat/>
+    <w:pPr>
+      <w:keepNext/>
+      <w:widowControl/>
+      <w:spacing w:after="120"/>
+    </w:pPr>
     <w:rPr>
       <w:rFonts w:ascii="Source Sans 3" w:hAnsi="Source Sans 3" w:eastAsia="Source Sans 3"/>
       <w:color w:val="0C2D57"/>
@@ -699,6 +690,11 @@
     <w:name w:val="NA Heading 1"/>
     <w:basedOn w:val="NABody"/>
     <w:qFormat/>
+    <w:pPr>
+      <w:keepNext/>
+      <w:widowControl/>
+      <w:spacing w:after="120"/>
+    </w:pPr>
     <w:rPr>
       <w:rFonts w:ascii="Source Sans 3" w:hAnsi="Source Sans 3" w:eastAsia="Source Sans 3"/>
       <w:color w:val="0C2D57"/>
@@ -711,6 +707,11 @@
     <w:name w:val="NA Heading 2"/>
     <w:basedOn w:val="NABody"/>
     <w:qFormat/>
+    <w:pPr>
+      <w:keepNext/>
+      <w:widowControl/>
+      <w:spacing w:after="120"/>
+    </w:pPr>
     <w:rPr>
       <w:rFonts w:ascii="Source Sans 3" w:hAnsi="Source Sans 3" w:eastAsia="Source Sans 3"/>
       <w:color w:val="0C2D57"/>
@@ -723,6 +724,11 @@
     <w:name w:val="NA Heading 3"/>
     <w:basedOn w:val="NABody"/>
     <w:qFormat/>
+    <w:pPr>
+      <w:keepNext/>
+      <w:widowControl/>
+      <w:spacing w:after="120"/>
+    </w:pPr>
     <w:rPr>
       <w:rFonts w:ascii="Source Sans 3" w:hAnsi="Source Sans 3" w:eastAsia="Source Sans 3"/>
       <w:color w:val="0C2D57"/>
@@ -734,6 +740,10 @@
   <w:style w:type="paragraph" w:styleId="NABody">
     <w:name w:val="NA Body"/>
     <w:qFormat/>
+    <w:pPr>
+      <w:widowControl/>
+      <w:spacing w:after="120"/>
+    </w:pPr>
     <w:rPr>
       <w:rFonts w:ascii="Libertinus Serif" w:hAnsi="Libertinus Serif" w:eastAsia="Libertinus Serif"/>
       <w:color w:val="0C2D57"/>
@@ -745,6 +755,10 @@
     <w:name w:val="NA Label"/>
     <w:basedOn w:val="NABody"/>
     <w:qFormat/>
+    <w:pPr>
+      <w:widowControl/>
+      <w:spacing w:after="120"/>
+    </w:pPr>
     <w:rPr>
       <w:rFonts w:ascii="Source Sans 3" w:hAnsi="Source Sans 3" w:eastAsia="Source Sans 3"/>
       <w:color w:val="0C2D57"/>
@@ -757,6 +771,10 @@
     <w:name w:val="NA Definition"/>
     <w:basedOn w:val="NABody"/>
     <w:qFormat/>
+    <w:pPr>
+      <w:widowControl/>
+      <w:spacing w:after="120"/>
+    </w:pPr>
     <w:rPr>
       <w:rFonts w:ascii="Libertinus Serif" w:hAnsi="Libertinus Serif" w:eastAsia="Libertinus Serif"/>
       <w:color w:val="0C2D57"/>
@@ -768,6 +786,10 @@
     <w:name w:val="NA Example"/>
     <w:basedOn w:val="NABody"/>
     <w:qFormat/>
+    <w:pPr>
+      <w:widowControl/>
+      <w:spacing w:after="120"/>
+    </w:pPr>
     <w:rPr>
       <w:rFonts w:ascii="Libertinus Serif" w:hAnsi="Libertinus Serif" w:eastAsia="Libertinus Serif"/>
       <w:color w:val="0C2D57"/>
@@ -779,6 +801,10 @@
     <w:name w:val="NA Remember"/>
     <w:basedOn w:val="NABody"/>
     <w:qFormat/>
+    <w:pPr>
+      <w:widowControl/>
+      <w:spacing w:after="120"/>
+    </w:pPr>
     <w:rPr>
       <w:rFonts w:ascii="Libertinus Serif" w:hAnsi="Libertinus Serif" w:eastAsia="Libertinus Serif"/>
       <w:color w:val="0C2D57"/>
@@ -791,6 +817,10 @@
     <w:name w:val="NA Exercise"/>
     <w:basedOn w:val="NABody"/>
     <w:qFormat/>
+    <w:pPr>
+      <w:widowControl/>
+      <w:spacing w:after="120"/>
+    </w:pPr>
     <w:rPr>
       <w:rFonts w:ascii="Libertinus Serif" w:hAnsi="Libertinus Serif" w:eastAsia="Libertinus Serif"/>
       <w:color w:val="0C2D57"/>
@@ -802,6 +832,10 @@
     <w:name w:val="NA Solution"/>
     <w:basedOn w:val="NABody"/>
     <w:qFormat/>
+    <w:pPr>
+      <w:widowControl/>
+      <w:spacing w:after="120"/>
+    </w:pPr>
     <w:rPr>
       <w:rFonts w:ascii="Libertinus Serif" w:hAnsi="Libertinus Serif" w:eastAsia="Libertinus Serif"/>
       <w:color w:val="0C2D57"/>
@@ -813,6 +847,10 @@
     <w:name w:val="NA Figure Caption"/>
     <w:basedOn w:val="NABody"/>
     <w:qFormat/>
+    <w:pPr>
+      <w:widowControl/>
+      <w:spacing w:after="120"/>
+    </w:pPr>
     <w:rPr>
       <w:rFonts w:ascii="Libertinus Serif" w:hAnsi="Libertinus Serif" w:eastAsia="Libertinus Serif"/>
       <w:color w:val="0C2D57"/>
@@ -825,6 +863,10 @@
     <w:name w:val="NA Table"/>
     <w:basedOn w:val="NABody"/>
     <w:qFormat/>
+    <w:pPr>
+      <w:widowControl/>
+      <w:spacing w:after="120"/>
+    </w:pPr>
     <w:rPr>
       <w:rFonts w:ascii="Libertinus Serif" w:hAnsi="Libertinus Serif" w:eastAsia="Libertinus Serif"/>
       <w:color w:val="0C2D57"/>
@@ -836,6 +878,10 @@
     <w:name w:val="NA Header"/>
     <w:basedOn w:val="NABody"/>
     <w:qFormat/>
+    <w:pPr>
+      <w:widowControl/>
+      <w:spacing w:after="120"/>
+    </w:pPr>
     <w:rPr>
       <w:rFonts w:ascii="Source Sans 3" w:hAnsi="Source Sans 3" w:eastAsia="Source Sans 3"/>
       <w:color w:val="0C2D57"/>
@@ -847,6 +893,10 @@
     <w:name w:val="NA Footer"/>
     <w:basedOn w:val="NABody"/>
     <w:qFormat/>
+    <w:pPr>
+      <w:widowControl/>
+      <w:spacing w:after="120"/>
+    </w:pPr>
     <w:rPr>
       <w:rFonts w:ascii="Source Sans 3" w:hAnsi="Source Sans 3" w:eastAsia="Source Sans 3"/>
       <w:color w:val="0C2D57"/>

</xml_diff>